<commit_message>
Menambahkan Pengertian Outlet Kedalam Panduan
</commit_message>
<xml_diff>
--- a/Panduan/Router.docx
+++ b/Panduan/Router.docx
@@ -4,17 +4,78 @@
   <w:body>
     <w:p>
       <w:r>
-        <w:t>path="/products" → alamat URL</w:t>
+        <w:t xml:space="preserve">path="/products" → </w:t>
+      </w:r>
+      <w:proofErr w:type="spellStart"/>
+      <w:r>
+        <w:t>alamat</w:t>
+      </w:r>
+      <w:proofErr w:type="spellEnd"/>
+      <w:r>
+        <w:t xml:space="preserve"> URL</w:t>
       </w:r>
     </w:p>
     <w:p>
       <w:r>
-        <w:t>element={&lt;Products /&gt;} → component yang ditampilkan</w:t>
-      </w:r>
+        <w:t>element</w:t>
+      </w:r>
+      <w:proofErr w:type="gramStart"/>
+      <w:r>
+        <w:t>={</w:t>
+      </w:r>
+      <w:proofErr w:type="gramEnd"/>
+      <w:r>
+        <w:t xml:space="preserve">&lt;Products /&gt;} → component yang </w:t>
+      </w:r>
+      <w:proofErr w:type="spellStart"/>
+      <w:r>
+        <w:t>ditampilkan</w:t>
+      </w:r>
+      <w:proofErr w:type="spellEnd"/>
     </w:p>
     <w:p>
       <w:r>
-        <w:t>Jadi untuk project kamu, saya sarankan pakai:</w:t>
+        <w:t xml:space="preserve">Jadi </w:t>
+      </w:r>
+      <w:proofErr w:type="spellStart"/>
+      <w:r>
+        <w:t>untuk</w:t>
+      </w:r>
+      <w:proofErr w:type="spellEnd"/>
+      <w:r>
+        <w:t xml:space="preserve"> project </w:t>
+      </w:r>
+      <w:proofErr w:type="spellStart"/>
+      <w:r>
+        <w:t>kamu</w:t>
+      </w:r>
+      <w:proofErr w:type="spellEnd"/>
+      <w:r>
+        <w:t xml:space="preserve">, </w:t>
+      </w:r>
+      <w:proofErr w:type="spellStart"/>
+      <w:r>
+        <w:t>saya</w:t>
+      </w:r>
+      <w:proofErr w:type="spellEnd"/>
+      <w:r>
+        <w:t xml:space="preserve"> </w:t>
+      </w:r>
+      <w:proofErr w:type="spellStart"/>
+      <w:r>
+        <w:t>sarankan</w:t>
+      </w:r>
+      <w:proofErr w:type="spellEnd"/>
+      <w:r>
+        <w:t xml:space="preserve"> </w:t>
+      </w:r>
+      <w:proofErr w:type="spellStart"/>
+      <w:r>
+        <w:t>pakai</w:t>
+      </w:r>
+      <w:proofErr w:type="spellEnd"/>
+      <w:r>
+        <w:t>:</w:t>
       </w:r>
     </w:p>
     <w:p>
@@ -67,16 +128,120 @@
     </w:p>
     <w:p>
       <w:r>
-        <w:t>Dan NavLink-nya juga disamakan:</w:t>
+        <w:t>Dan NavLink-</w:t>
+      </w:r>
+      <w:proofErr w:type="spellStart"/>
+      <w:r>
+        <w:t>nya</w:t>
+      </w:r>
+      <w:proofErr w:type="spellEnd"/>
+      <w:r>
+        <w:t xml:space="preserve"> juga </w:t>
+      </w:r>
+      <w:proofErr w:type="spellStart"/>
+      <w:r>
+        <w:t>disamakan</w:t>
+      </w:r>
+      <w:proofErr w:type="spellEnd"/>
+      <w:r>
+        <w:t>:</w:t>
       </w:r>
     </w:p>
     <w:p>
-      <w:r>
-        <w:t>Catatan: React Router bisa menangani path dengan huruf besar, tetapi convention yang lebih umum dan aman adalah lowercase.</w:t>
+      <w:proofErr w:type="spellStart"/>
+      <w:r>
+        <w:t>Catatan</w:t>
+      </w:r>
+      <w:proofErr w:type="spellEnd"/>
+      <w:r>
+        <w:t xml:space="preserve">: React Router </w:t>
+      </w:r>
+      <w:proofErr w:type="spellStart"/>
+      <w:r>
+        <w:t>bisa</w:t>
+      </w:r>
+      <w:proofErr w:type="spellEnd"/>
+      <w:r>
+        <w:t xml:space="preserve"> </w:t>
+      </w:r>
+      <w:proofErr w:type="spellStart"/>
+      <w:r>
+        <w:t>menangani</w:t>
+      </w:r>
+      <w:proofErr w:type="spellEnd"/>
+      <w:r>
+        <w:t xml:space="preserve"> path </w:t>
+      </w:r>
+      <w:proofErr w:type="spellStart"/>
+      <w:r>
+        <w:t>dengan</w:t>
+      </w:r>
+      <w:proofErr w:type="spellEnd"/>
+      <w:r>
+        <w:t xml:space="preserve"> </w:t>
+      </w:r>
+      <w:proofErr w:type="spellStart"/>
+      <w:r>
+        <w:t>huruf</w:t>
+      </w:r>
+      <w:proofErr w:type="spellEnd"/>
+      <w:r>
+        <w:t xml:space="preserve"> </w:t>
+      </w:r>
+      <w:proofErr w:type="spellStart"/>
+      <w:r>
+        <w:t>besar</w:t>
+      </w:r>
+      <w:proofErr w:type="spellEnd"/>
+      <w:r>
+        <w:t xml:space="preserve">, </w:t>
+      </w:r>
+      <w:proofErr w:type="spellStart"/>
+      <w:r>
+        <w:t>tetapi</w:t>
+      </w:r>
+      <w:proofErr w:type="spellEnd"/>
+      <w:r>
+        <w:t xml:space="preserve"> convention yang </w:t>
+      </w:r>
+      <w:proofErr w:type="spellStart"/>
+      <w:r>
+        <w:t>lebih</w:t>
+      </w:r>
+      <w:proofErr w:type="spellEnd"/>
+      <w:r>
+        <w:t xml:space="preserve"> </w:t>
+      </w:r>
+      <w:proofErr w:type="spellStart"/>
+      <w:r>
+        <w:t>umum</w:t>
+      </w:r>
+      <w:proofErr w:type="spellEnd"/>
+      <w:r>
+        <w:t xml:space="preserve"> dan </w:t>
+      </w:r>
+      <w:proofErr w:type="spellStart"/>
+      <w:r>
+        <w:t>aman</w:t>
+      </w:r>
+      <w:proofErr w:type="spellEnd"/>
+      <w:r>
+        <w:t xml:space="preserve"> </w:t>
+      </w:r>
+      <w:proofErr w:type="spellStart"/>
+      <w:r>
+        <w:t>adalah</w:t>
+      </w:r>
+      <w:proofErr w:type="spellEnd"/>
+      <w:r>
+        <w:t xml:space="preserve"> lowercase.</w:t>
       </w:r>
     </w:p>
     <w:p>
       <w:r>
+        <w:rPr>
+          <w:noProof/>
+        </w:rPr>
         <w:lastRenderedPageBreak/>
         <w:drawing>
           <wp:inline distT="0" distB="0" distL="0" distR="0" wp14:anchorId="6FF0D790" wp14:editId="7D319A91">
@@ -103,6 +268,275 @@
                     <a:xfrm>
                       <a:off x="0" y="0"/>
                       <a:ext cx="5039995" cy="2849880"/>
+                    </a:xfrm>
+                    <a:prstGeom prst="rect">
+                      <a:avLst/>
+                    </a:prstGeom>
+                  </pic:spPr>
+                </pic:pic>
+              </a:graphicData>
+            </a:graphic>
+          </wp:inline>
+        </w:drawing>
+      </w:r>
+    </w:p>
+    <w:p/>
+    <w:p/>
+    <w:p/>
+    <w:p/>
+    <w:p/>
+    <w:p/>
+    <w:p/>
+    <w:p/>
+    <w:p/>
+    <w:p/>
+    <w:p/>
+    <w:p/>
+    <w:p/>
+    <w:p/>
+    <w:p>
+      <w:r>
+        <w:lastRenderedPageBreak/>
+        <w:t xml:space="preserve">Outlet </w:t>
+      </w:r>
+      <w:proofErr w:type="gramStart"/>
+      <w:r>
+        <w:t xml:space="preserve">= </w:t>
+      </w:r>
+      <w:r>
+        <w:t> </w:t>
+      </w:r>
+      <w:proofErr w:type="spellStart"/>
+      <w:r>
+        <w:t>Fungsinya</w:t>
+      </w:r>
+      <w:proofErr w:type="spellEnd"/>
+      <w:proofErr w:type="gramEnd"/>
+      <w:r>
+        <w:t xml:space="preserve"> </w:t>
+      </w:r>
+      <w:proofErr w:type="spellStart"/>
+      <w:r>
+        <w:t>untuk</w:t>
+      </w:r>
+      <w:proofErr w:type="spellEnd"/>
+      <w:r>
+        <w:t xml:space="preserve"> </w:t>
+      </w:r>
+      <w:proofErr w:type="spellStart"/>
+      <w:r>
+        <w:t>menjadi</w:t>
+      </w:r>
+      <w:proofErr w:type="spellEnd"/>
+      <w:r>
+        <w:t xml:space="preserve"> “</w:t>
+      </w:r>
+      <w:proofErr w:type="spellStart"/>
+      <w:r>
+        <w:t>tempat</w:t>
+      </w:r>
+      <w:proofErr w:type="spellEnd"/>
+      <w:r>
+        <w:t>” di mana </w:t>
+      </w:r>
+      <w:r>
+        <w:rPr>
+          <w:b/>
+          <w:bCs/>
+        </w:rPr>
+        <w:t>child route</w:t>
+      </w:r>
+      <w:r>
+        <w:t> </w:t>
+      </w:r>
+      <w:proofErr w:type="spellStart"/>
+      <w:r>
+        <w:t>akan</w:t>
+      </w:r>
+      <w:proofErr w:type="spellEnd"/>
+      <w:r>
+        <w:t xml:space="preserve"> </w:t>
+      </w:r>
+      <w:proofErr w:type="spellStart"/>
+      <w:r>
+        <w:t>ditampilkan</w:t>
+      </w:r>
+      <w:proofErr w:type="spellEnd"/>
+      <w:r>
+        <w:t>.</w:t>
+      </w:r>
+    </w:p>
+    <w:p>
+      <w:proofErr w:type="spellStart"/>
+      <w:r>
+        <w:t>Contoh</w:t>
+      </w:r>
+      <w:proofErr w:type="spellEnd"/>
+      <w:r>
+        <w:t xml:space="preserve"> </w:t>
+      </w:r>
+      <w:proofErr w:type="spellStart"/>
+      <w:r>
+        <w:t>penggunaannya</w:t>
+      </w:r>
+      <w:proofErr w:type="spellEnd"/>
+    </w:p>
+    <w:p>
+      <w:r>
+        <w:t xml:space="preserve">import </w:t>
+      </w:r>
+      <w:proofErr w:type="gramStart"/>
+      <w:r>
+        <w:t>{ Outlet</w:t>
+      </w:r>
+      <w:proofErr w:type="gramEnd"/>
+      <w:r>
+        <w:t xml:space="preserve">, </w:t>
+      </w:r>
+      <w:proofErr w:type="gramStart"/>
+      <w:r>
+        <w:t>Link }</w:t>
+      </w:r>
+      <w:proofErr w:type="gramEnd"/>
+      <w:r>
+        <w:t xml:space="preserve"> from "react-router-</w:t>
+      </w:r>
+      <w:proofErr w:type="spellStart"/>
+      <w:r>
+        <w:t>dom</w:t>
+      </w:r>
+      <w:proofErr w:type="spellEnd"/>
+      <w:r>
+        <w:t>";</w:t>
+      </w:r>
+    </w:p>
+    <w:p/>
+    <w:p>
+      <w:r>
+        <w:t xml:space="preserve">function </w:t>
+      </w:r>
+      <w:proofErr w:type="gramStart"/>
+      <w:r>
+        <w:t>Layout(</w:t>
+      </w:r>
+      <w:proofErr w:type="gramEnd"/>
+      <w:r>
+        <w:t>) {</w:t>
+      </w:r>
+    </w:p>
+    <w:p>
+      <w:r>
+        <w:rPr>
+          <w:noProof/>
+        </w:rPr>
+        <w:drawing>
+          <wp:inline distT="0" distB="0" distL="0" distR="0" wp14:anchorId="02D32ED9" wp14:editId="05B07E31">
+            <wp:extent cx="5039995" cy="3585210"/>
+            <wp:effectExtent l="0" t="0" r="8255" b="0"/>
+            <wp:docPr id="502491282" name="Picture 1"/>
+            <wp:cNvGraphicFramePr>
+              <a:graphicFrameLocks xmlns:a="http://schemas.openxmlformats.org/drawingml/2006/main" noChangeAspect="1"/>
+            </wp:cNvGraphicFramePr>
+            <a:graphic xmlns:a="http://schemas.openxmlformats.org/drawingml/2006/main">
+              <a:graphicData uri="http://schemas.openxmlformats.org/drawingml/2006/picture">
+                <pic:pic xmlns:pic="http://schemas.openxmlformats.org/drawingml/2006/picture">
+                  <pic:nvPicPr>
+                    <pic:cNvPr id="502491282" name="Picture 502491282"/>
+                    <pic:cNvPicPr/>
+                  </pic:nvPicPr>
+                  <pic:blipFill>
+                    <a:blip r:embed="rId7" cstate="print">
+                      <a:extLst>
+                        <a:ext uri="{28A0092B-C50C-407E-A947-70E740481C1C}">
+                          <a14:useLocalDpi xmlns:a14="http://schemas.microsoft.com/office/drawing/2010/main" val="0"/>
+                        </a:ext>
+                      </a:extLst>
+                    </a:blip>
+                    <a:stretch>
+                      <a:fillRect/>
+                    </a:stretch>
+                  </pic:blipFill>
+                  <pic:spPr>
+                    <a:xfrm>
+                      <a:off x="0" y="0"/>
+                      <a:ext cx="5039995" cy="3585210"/>
+                    </a:xfrm>
+                    <a:prstGeom prst="rect">
+                      <a:avLst/>
+                    </a:prstGeom>
+                  </pic:spPr>
+                </pic:pic>
+              </a:graphicData>
+            </a:graphic>
+          </wp:inline>
+        </w:drawing>
+      </w:r>
+    </w:p>
+    <w:p>
+      <w:pPr>
+        <w:tabs>
+          <w:tab w:val="left" w:pos="930"/>
+        </w:tabs>
+      </w:pPr>
+      <w:proofErr w:type="spellStart"/>
+      <w:r>
+        <w:t>Penggunaan</w:t>
+      </w:r>
+      <w:proofErr w:type="spellEnd"/>
+      <w:r>
+        <w:t xml:space="preserve"> </w:t>
+      </w:r>
+      <w:proofErr w:type="spellStart"/>
+      <w:r>
+        <w:t>dalam</w:t>
+      </w:r>
+      <w:proofErr w:type="spellEnd"/>
+      <w:r>
+        <w:t xml:space="preserve"> router</w:t>
+      </w:r>
+    </w:p>
+    <w:p>
+      <w:pPr>
+        <w:tabs>
+          <w:tab w:val="left" w:pos="930"/>
+        </w:tabs>
+      </w:pPr>
+      <w:r>
+        <w:rPr>
+          <w:noProof/>
+        </w:rPr>
+        <w:lastRenderedPageBreak/>
+        <w:drawing>
+          <wp:inline distT="0" distB="0" distL="0" distR="0" wp14:anchorId="6EABB165" wp14:editId="55CBFAB9">
+            <wp:extent cx="5039995" cy="2976880"/>
+            <wp:effectExtent l="0" t="0" r="8255" b="0"/>
+            <wp:docPr id="239282342" name="Picture 2"/>
+            <wp:cNvGraphicFramePr>
+              <a:graphicFrameLocks xmlns:a="http://schemas.openxmlformats.org/drawingml/2006/main" noChangeAspect="1"/>
+            </wp:cNvGraphicFramePr>
+            <a:graphic xmlns:a="http://schemas.openxmlformats.org/drawingml/2006/main">
+              <a:graphicData uri="http://schemas.openxmlformats.org/drawingml/2006/picture">
+                <pic:pic xmlns:pic="http://schemas.openxmlformats.org/drawingml/2006/picture">
+                  <pic:nvPicPr>
+                    <pic:cNvPr id="239282342" name="Picture 239282342"/>
+                    <pic:cNvPicPr/>
+                  </pic:nvPicPr>
+                  <pic:blipFill>
+                    <a:blip r:embed="rId8">
+                      <a:extLst>
+                        <a:ext uri="{28A0092B-C50C-407E-A947-70E740481C1C}">
+                          <a14:useLocalDpi xmlns:a14="http://schemas.microsoft.com/office/drawing/2010/main" val="0"/>
+                        </a:ext>
+                      </a:extLst>
+                    </a:blip>
+                    <a:stretch>
+                      <a:fillRect/>
+                    </a:stretch>
+                  </pic:blipFill>
+                  <pic:spPr>
+                    <a:xfrm>
+                      <a:off x="0" y="0"/>
+                      <a:ext cx="5039995" cy="2976880"/>
                     </a:xfrm>
                     <a:prstGeom prst="rect">
                       <a:avLst/>
@@ -965,7 +1399,6 @@
   <w:style w:type="character" w:default="1" w:styleId="DefaultParagraphFont">
     <w:name w:val="Default Paragraph Font"/>
     <w:uiPriority w:val="1"/>
-    <w:semiHidden/>
     <w:unhideWhenUsed/>
   </w:style>
   <w:style w:type="table" w:default="1" w:styleId="TableNormal">

</xml_diff>